<commit_message>
commit to new branch
</commit_message>
<xml_diff>
--- a/Miscellaneous notes.docx
+++ b/Miscellaneous notes.docx
@@ -3,7 +3,7 @@
 <w:document xmlns:wpc="http://schemas.microsoft.com/office/word/2010/wordprocessingCanvas" xmlns:cx="http://schemas.microsoft.com/office/drawing/2014/chartex" xmlns:cx1="http://schemas.microsoft.com/office/drawing/2015/9/8/chartex" xmlns:cx2="http://schemas.microsoft.com/office/drawing/2015/10/21/chartex" xmlns:cx3="http://schemas.microsoft.com/office/drawing/2016/5/9/chartex" xmlns:cx4="http://schemas.microsoft.com/office/drawing/2016/5/10/chartex" xmlns:cx5="http://schemas.microsoft.com/office/drawing/2016/5/11/chartex" xmlns:cx6="http://schemas.microsoft.com/office/drawing/2016/5/12/chartex" xmlns:cx7="http://schemas.microsoft.com/office/drawing/2016/5/13/chartex" xmlns:cx8="http://schemas.microsoft.com/office/drawing/2016/5/14/chartex" xmlns:mc="http://schemas.openxmlformats.org/markup-compatibility/2006" xmlns:aink="http://schemas.microsoft.com/office/drawing/2016/ink" xmlns:am3d="http://schemas.microsoft.com/office/drawing/2017/model3d" xmlns:o="urn:schemas-microsoft-com:office:office" xmlns:oel="http://schemas.microsoft.com/office/2019/extlst" xmlns:r="http://schemas.openxmlformats.org/officeDocument/2006/relationships" xmlns:m="http://schemas.openxmlformats.org/officeDocument/2006/math" xmlns:v="urn:schemas-microsoft-com:vml" xmlns:wp14="http://schemas.microsoft.com/office/word/2010/wordprocessingDrawing" xmlns:wp="http://schemas.openxmlformats.org/drawingml/2006/wordprocessingDrawing" xmlns:w10="urn:schemas-microsoft-com:office:word" xmlns:w="http://schemas.openxmlformats.org/wordprocessingml/2006/main" xmlns:w14="http://schemas.microsoft.com/office/word/2010/wordml" xmlns:w15="http://schemas.microsoft.com/office/word/2012/wordml" xmlns:w16cex="http://schemas.microsoft.com/office/word/2018/wordml/cex" xmlns:w16cid="http://schemas.microsoft.com/office/word/2016/wordml/cid" xmlns:w16="http://schemas.microsoft.com/office/word/2018/wordml" xmlns:w16du="http://schemas.microsoft.com/office/word/2023/wordml/word16du" xmlns:w16sdtdh="http://schemas.microsoft.com/office/word/2020/wordml/sdtdatahash" xmlns:w16sdtfl="http://schemas.microsoft.com/office/word/2024/wordml/sdtformatlock" xmlns:w16se="http://schemas.microsoft.com/office/word/2015/wordml/symex" xmlns:wpg="http://schemas.microsoft.com/office/word/2010/wordprocessingGroup" xmlns:wpi="http://schemas.microsoft.com/office/word/2010/wordprocessingInk" xmlns:wne="http://schemas.microsoft.com/office/word/2006/wordml" xmlns:wps="http://schemas.microsoft.com/office/word/2010/wordprocessingShape" mc:Ignorable="w14 w15 w16se w16cid w16 w16cex w16sdtdh w16sdtfl w16du wp14">
   <w:body>
     <w:p>
-      <w:hyperlink r:id="rId5" w:history="1">
+      <w:hyperlink r:id="rId5" w:anchor="/" w:history="1">
         <w:r>
           <w:rPr>
             <w:rStyle w:val="Hyperlink"/>
@@ -42,6 +42,47 @@
       </w:r>
       <w:r>
         <w:t>It seems to be a rate change</w:t>
+      </w:r>
+    </w:p>
+    <w:p>
+      <w:pPr>
+        <w:pStyle w:val="ListParagraph"/>
+        <w:numPr>
+          <w:ilvl w:val="2"/>
+          <w:numId w:val="1"/>
+        </w:numPr>
+      </w:pPr>
+      <w:r>
+        <w:t xml:space="preserve">Based on deep research analysis, the “devaiation” filings are done when one wants to deviate from a rating bureau’s rates and </w:t>
+      </w:r>
+      <w:r>
+        <w:t>it explicitly calls out NC as an example</w:t>
+      </w:r>
+    </w:p>
+    <w:p>
+      <w:r>
+        <w:t xml:space="preserve">Forms: </w:t>
+      </w:r>
+    </w:p>
+    <w:p>
+      <w:r>
+        <w:t>ASI –</w:t>
+      </w:r>
+      <w:r>
+        <w:t xml:space="preserve">  </w:t>
+      </w:r>
+      <w:hyperlink r:id="rId6" w:history="1">
+        <w:r>
+          <w:rPr>
+            <w:rStyle w:val="Hyperlink"/>
+          </w:rPr>
+          <w:t>WI_AMSI-133860671.pdf</w:t>
+        </w:r>
+      </w:hyperlink>
+    </w:p>
+    <w:p>
+      <w:r>
+        <w:t>Has a large list of the different endorsements that are available in WI through ASI</w:t>
       </w:r>
     </w:p>
     <w:sectPr>
@@ -84,7 +125,7 @@
         <w:rFonts w:ascii="Courier New" w:hAnsi="Courier New" w:cs="Courier New" w:hint="default"/>
       </w:rPr>
     </w:lvl>
-    <w:lvl w:ilvl="2" w:tplc="04090005" w:tentative="1">
+    <w:lvl w:ilvl="2" w:tplc="04090005">
       <w:start w:val="1"/>
       <w:numFmt w:val="bullet"/>
       <w:lvlText w:val=""/>
@@ -778,7 +819,6 @@
   <w:style w:type="character" w:default="1" w:styleId="DefaultParagraphFont">
     <w:name w:val="Default Paragraph Font"/>
     <w:uiPriority w:val="1"/>
-    <w:semiHidden/>
     <w:unhideWhenUsed/>
   </w:style>
   <w:style w:type="table" w:default="1" w:styleId="TableNormal">
@@ -1113,6 +1153,18 @@
     <w:rPr>
       <w:color w:val="605E5C"/>
       <w:shd w:val="clear" w:color="auto" w:fill="E1DFDD"/>
+    </w:rPr>
+  </w:style>
+  <w:style w:type="character" w:styleId="FollowedHyperlink">
+    <w:name w:val="FollowedHyperlink"/>
+    <w:basedOn w:val="DefaultParagraphFont"/>
+    <w:uiPriority w:val="99"/>
+    <w:semiHidden/>
+    <w:unhideWhenUsed/>
+    <w:rsid w:val="00B7134A"/>
+    <w:rPr>
+      <w:color w:val="96607D" w:themeColor="followedHyperlink"/>
+      <w:u w:val="single"/>
     </w:rPr>
   </w:style>
 </w:styles>

</xml_diff>